<commit_message>
Fase 1 presentacion actualizada
</commit_message>
<xml_diff>
--- a/Entrega 1/Evidencias Grupales/1.5_Fase 1_Definicion Proyecto APT.docx
+++ b/Entrega 1/Evidencias Grupales/1.5_Fase 1_Definicion Proyecto APT.docx
@@ -838,10 +838,6 @@
             </w:pPr>
             <w:proofErr w:type="spellStart"/>
             <w:r>
-              <w:rPr>
-                <w:sz w:val="20"/>
-                <w:szCs w:val="20"/>
-              </w:rPr>
               <w:t>ServiHogar</w:t>
             </w:r>
             <w:proofErr w:type="spellEnd"/>
@@ -883,10 +879,6 @@
               </w:rPr>
             </w:pPr>
             <w:r>
-              <w:rPr>
-                <w:sz w:val="20"/>
-                <w:szCs w:val="20"/>
-              </w:rPr>
               <w:t>Área de Software</w:t>
             </w:r>
           </w:p>
@@ -929,15 +921,12 @@
           </w:tcPr>
           <w:p>
             <w:pPr>
+              <w:spacing w:line="240" w:lineRule="auto"/>
               <w:rPr>
                 <w:b/>
               </w:rPr>
             </w:pPr>
             <w:r>
-              <w:rPr>
-                <w:sz w:val="20"/>
-                <w:szCs w:val="20"/>
-              </w:rPr>
               <w:t>Desarrollar una solución de software utilizando técnicas que permitan sistematizar el proceso de desarrollo y mantenimiento, asegurando el logro de los objetivos.</w:t>
             </w:r>
           </w:p>
@@ -1080,224 +1069,160 @@
           </w:tcPr>
           <w:p>
             <w:pPr>
-              <w:spacing w:before="240" w:after="240"/>
+              <w:spacing w:before="240" w:after="240" w:line="240" w:lineRule="auto"/>
               <w:jc w:val="both"/>
               <w:rPr>
                 <w:iCs/>
-                <w:sz w:val="20"/>
-                <w:szCs w:val="20"/>
-              </w:rPr>
-            </w:pPr>
-            <w:r>
-              <w:rPr>
-                <w:iCs/>
-                <w:sz w:val="20"/>
-                <w:szCs w:val="20"/>
+              </w:rPr>
+            </w:pPr>
+            <w:r>
+              <w:rPr>
+                <w:iCs/>
               </w:rPr>
               <w:t xml:space="preserve">Actualmente, muchas personas requieren servicios a domicilio como </w:t>
             </w:r>
             <w:r>
               <w:rPr>
                 <w:iCs/>
-                <w:sz w:val="20"/>
-                <w:szCs w:val="20"/>
               </w:rPr>
               <w:t>limpieza del hogar</w:t>
             </w:r>
             <w:r>
               <w:rPr>
                 <w:iCs/>
-                <w:sz w:val="20"/>
-                <w:szCs w:val="20"/>
               </w:rPr>
               <w:t>, gasfitería</w:t>
             </w:r>
             <w:r>
               <w:rPr>
                 <w:iCs/>
-                <w:sz w:val="20"/>
-                <w:szCs w:val="20"/>
               </w:rPr>
               <w:t xml:space="preserve"> </w:t>
             </w:r>
             <w:r>
               <w:rPr>
                 <w:iCs/>
-                <w:sz w:val="20"/>
-                <w:szCs w:val="20"/>
               </w:rPr>
               <w:t>o jardinería, pero no cuentan con una plataforma confiable para encontrar profesionales en su zona. A la vez, muchos trabajadores independientes</w:t>
             </w:r>
             <w:r>
               <w:rPr>
                 <w:iCs/>
-                <w:sz w:val="20"/>
-                <w:szCs w:val="20"/>
               </w:rPr>
               <w:t xml:space="preserve"> </w:t>
             </w:r>
             <w:r>
               <w:rPr>
                 <w:iCs/>
-                <w:sz w:val="20"/>
-                <w:szCs w:val="20"/>
               </w:rPr>
               <w:t>tienen poca visibilidad y dificultades para captar clientes.</w:t>
             </w:r>
           </w:p>
           <w:p>
             <w:pPr>
-              <w:spacing w:before="240" w:after="240"/>
+              <w:spacing w:before="240" w:after="240" w:line="240" w:lineRule="auto"/>
               <w:jc w:val="both"/>
               <w:rPr>
                 <w:iCs/>
-                <w:sz w:val="20"/>
-                <w:szCs w:val="20"/>
-              </w:rPr>
-            </w:pPr>
-            <w:r>
-              <w:rPr>
-                <w:iCs/>
-                <w:sz w:val="20"/>
-                <w:szCs w:val="20"/>
+              </w:rPr>
+            </w:pPr>
+            <w:r>
+              <w:rPr>
+                <w:iCs/>
               </w:rPr>
               <w:t xml:space="preserve">Este proyecto busca desarrollar una plataforma web que conecte a clientes con trabajadores </w:t>
             </w:r>
             <w:r>
               <w:rPr>
                 <w:iCs/>
-                <w:sz w:val="20"/>
-                <w:szCs w:val="20"/>
               </w:rPr>
               <w:t xml:space="preserve">independientes </w:t>
             </w:r>
             <w:r>
               <w:rPr>
                 <w:iCs/>
-                <w:sz w:val="20"/>
-                <w:szCs w:val="20"/>
               </w:rPr>
               <w:t xml:space="preserve">que ofrecen servicios en el hogar, organizando la información por regiones y comunas, y mostrando </w:t>
             </w:r>
             <w:r>
               <w:rPr>
                 <w:iCs/>
-                <w:sz w:val="20"/>
-                <w:szCs w:val="20"/>
-              </w:rPr>
-              <w:t xml:space="preserve">tarjetas de servicios con la información </w:t>
-            </w:r>
-            <w:r>
-              <w:rPr>
-                <w:iCs/>
-                <w:sz w:val="20"/>
-                <w:szCs w:val="20"/>
-              </w:rPr>
-              <w:t>n</w:t>
-            </w:r>
-            <w:r>
-              <w:rPr>
-                <w:iCs/>
-                <w:sz w:val="20"/>
-                <w:szCs w:val="20"/>
-              </w:rPr>
-              <w:t>ecesaria.</w:t>
-            </w:r>
-          </w:p>
-          <w:p>
-            <w:pPr>
-              <w:spacing w:before="240" w:after="240"/>
+              </w:rPr>
+              <w:t>tarjetas de servicios con la información necesaria.</w:t>
+            </w:r>
+          </w:p>
+          <w:p>
+            <w:pPr>
+              <w:spacing w:before="240" w:after="240" w:line="240" w:lineRule="auto"/>
               <w:jc w:val="both"/>
               <w:rPr>
                 <w:iCs/>
-                <w:sz w:val="20"/>
-                <w:szCs w:val="20"/>
-              </w:rPr>
-            </w:pPr>
-            <w:r>
-              <w:rPr>
-                <w:iCs/>
-                <w:sz w:val="20"/>
-                <w:szCs w:val="20"/>
+              </w:rPr>
+            </w:pPr>
+            <w:r>
+              <w:rPr>
+                <w:iCs/>
               </w:rPr>
               <w:t xml:space="preserve">El proyecto se enfocará inicialmente en </w:t>
             </w:r>
             <w:r>
               <w:rPr>
                 <w:iCs/>
-                <w:sz w:val="20"/>
-                <w:szCs w:val="20"/>
               </w:rPr>
               <w:t>Chile</w:t>
             </w:r>
             <w:r>
               <w:rPr>
                 <w:iCs/>
-                <w:sz w:val="20"/>
-                <w:szCs w:val="20"/>
               </w:rPr>
               <w:t>. Beneficiará tanto a usuarios como a trabajadores, promoviendo la formalización, organización y mayor acceso a oportunidades laborales.</w:t>
             </w:r>
           </w:p>
           <w:p>
             <w:pPr>
-              <w:spacing w:before="240" w:after="240"/>
+              <w:spacing w:before="240" w:after="240" w:line="240" w:lineRule="auto"/>
               <w:jc w:val="both"/>
               <w:rPr>
                 <w:iCs/>
-                <w:sz w:val="20"/>
-                <w:szCs w:val="20"/>
-              </w:rPr>
-            </w:pPr>
-            <w:r>
-              <w:rPr>
-                <w:iCs/>
-                <w:sz w:val="20"/>
-                <w:szCs w:val="20"/>
+              </w:rPr>
+            </w:pPr>
+            <w:r>
+              <w:rPr>
+                <w:iCs/>
               </w:rPr>
               <w:t>Desde la perspectiva de la Ingeniería en Informática, es relevante porque implica la planificación, diseño e implementación de una solución digital que responde a una necesidad real, aplicando conocimientos técnicos como análisis de requerimientos, arquitectura web</w:t>
             </w:r>
             <w:r>
               <w:rPr>
                 <w:iCs/>
-                <w:sz w:val="20"/>
-                <w:szCs w:val="20"/>
               </w:rPr>
               <w:t>,</w:t>
             </w:r>
             <w:r>
               <w:rPr>
                 <w:iCs/>
-                <w:sz w:val="20"/>
-                <w:szCs w:val="20"/>
               </w:rPr>
               <w:t xml:space="preserve"> gestión de proyectos</w:t>
             </w:r>
             <w:r>
               <w:rPr>
                 <w:iCs/>
-                <w:sz w:val="20"/>
-                <w:szCs w:val="20"/>
               </w:rPr>
               <w:t xml:space="preserve"> e inteligencia de negocios</w:t>
             </w:r>
             <w:r>
               <w:rPr>
                 <w:iCs/>
-                <w:sz w:val="20"/>
-                <w:szCs w:val="20"/>
               </w:rPr>
               <w:t>.</w:t>
             </w:r>
           </w:p>
           <w:p>
             <w:pPr>
-              <w:spacing w:before="240" w:after="240"/>
+              <w:spacing w:before="240" w:after="240" w:line="240" w:lineRule="auto"/>
               <w:jc w:val="both"/>
               <w:rPr>
                 <w:iCs/>
-                <w:sz w:val="20"/>
-                <w:szCs w:val="20"/>
               </w:rPr>
             </w:pPr>
             <w:r>
@@ -1305,28 +1230,22 @@
                 <w:b/>
                 <w:bCs/>
                 <w:iCs/>
-                <w:sz w:val="20"/>
-                <w:szCs w:val="20"/>
               </w:rPr>
               <w:t>Valor Diferencial</w:t>
             </w:r>
           </w:p>
           <w:p>
             <w:pPr>
-              <w:spacing w:before="240" w:after="240"/>
+              <w:spacing w:before="240" w:after="240" w:line="240" w:lineRule="auto"/>
               <w:jc w:val="both"/>
               <w:rPr>
                 <w:iCs/>
-                <w:sz w:val="20"/>
-                <w:szCs w:val="20"/>
               </w:rPr>
             </w:pPr>
             <w:proofErr w:type="spellStart"/>
             <w:r>
               <w:rPr>
                 <w:iCs/>
-                <w:sz w:val="20"/>
-                <w:szCs w:val="20"/>
               </w:rPr>
               <w:t>ServiHogar</w:t>
             </w:r>
@@ -1334,80 +1253,60 @@
             <w:r>
               <w:rPr>
                 <w:iCs/>
-                <w:sz w:val="20"/>
-                <w:szCs w:val="20"/>
               </w:rPr>
               <w:t xml:space="preserve"> estará disponible en </w:t>
             </w:r>
             <w:r>
               <w:rPr>
                 <w:iCs/>
-                <w:sz w:val="20"/>
-                <w:szCs w:val="20"/>
               </w:rPr>
               <w:t>todas las regiones de</w:t>
             </w:r>
             <w:r>
               <w:rPr>
                 <w:iCs/>
-                <w:sz w:val="20"/>
-                <w:szCs w:val="20"/>
               </w:rPr>
               <w:t xml:space="preserve"> Chi</w:t>
             </w:r>
             <w:r>
               <w:rPr>
                 <w:iCs/>
-                <w:sz w:val="20"/>
-                <w:szCs w:val="20"/>
               </w:rPr>
               <w:t xml:space="preserve">le, en el cual podemos obtener un análisis de tendencias </w:t>
             </w:r>
             <w:r>
               <w:rPr>
                 <w:iCs/>
-                <w:sz w:val="20"/>
-                <w:szCs w:val="20"/>
               </w:rPr>
               <w:t xml:space="preserve">con </w:t>
             </w:r>
             <w:r>
               <w:rPr>
                 <w:iCs/>
-                <w:sz w:val="20"/>
-                <w:szCs w:val="20"/>
               </w:rPr>
               <w:t>los servicios que más se solicitan</w:t>
             </w:r>
             <w:r>
               <w:rPr>
                 <w:iCs/>
-                <w:sz w:val="20"/>
-                <w:szCs w:val="20"/>
               </w:rPr>
               <w:t xml:space="preserve"> por zona</w:t>
             </w:r>
             <w:r>
               <w:rPr>
                 <w:iCs/>
-                <w:sz w:val="20"/>
-                <w:szCs w:val="20"/>
               </w:rPr>
               <w:t xml:space="preserve">, podremos comparar que porcentaje de la población prefiere modernizarse al hacer uso de esta plataforma y analizar preferencias de los usuarios </w:t>
             </w:r>
             <w:r>
               <w:rPr>
                 <w:iCs/>
-                <w:sz w:val="20"/>
-                <w:szCs w:val="20"/>
               </w:rPr>
               <w:t>en base</w:t>
             </w:r>
             <w:r>
               <w:rPr>
                 <w:iCs/>
-                <w:sz w:val="20"/>
-                <w:szCs w:val="20"/>
               </w:rPr>
               <w:t xml:space="preserve"> a la edad o género.</w:t>
             </w:r>
@@ -1444,29 +1343,25 @@
           </w:tcPr>
           <w:p>
             <w:pPr>
+              <w:spacing w:line="240" w:lineRule="auto"/>
               <w:jc w:val="both"/>
               <w:rPr>
                 <w:iCs/>
-                <w:sz w:val="20"/>
-                <w:szCs w:val="20"/>
-              </w:rPr>
-            </w:pPr>
-            <w:r>
-              <w:rPr>
-                <w:iCs/>
-                <w:sz w:val="20"/>
-                <w:szCs w:val="20"/>
+              </w:rPr>
+            </w:pPr>
+            <w:r>
+              <w:rPr>
+                <w:iCs/>
               </w:rPr>
               <w:t>Actualmente, muchos de estos trabajadores dependen casi exclusivamente de recomendaciones boca a boca o contactos limitados en redes sociales, lo que restringe su alcance y oportunidades. Nuestra propuesta busca digitalizar y profesionalizar esta conexión, ofreciendo un espacio donde puedan crear un perfil, administrar su oferta de servicios y recibir contrataciones de forma directa y segura.</w:t>
             </w:r>
           </w:p>
           <w:p>
             <w:pPr>
+              <w:spacing w:line="240" w:lineRule="auto"/>
               <w:jc w:val="both"/>
               <w:rPr>
                 <w:iCs/>
-                <w:sz w:val="20"/>
-                <w:szCs w:val="20"/>
               </w:rPr>
             </w:pPr>
             <w:r>
@@ -1474,8 +1369,6 @@
                 <w:b/>
                 <w:bCs/>
                 <w:iCs/>
-                <w:sz w:val="20"/>
-                <w:szCs w:val="20"/>
               </w:rPr>
               <w:t>Funcionamiento y características principales</w:t>
             </w:r>
@@ -1486,10 +1379,9 @@
                 <w:ilvl w:val="0"/>
                 <w:numId w:val="8"/>
               </w:numPr>
-              <w:rPr>
-                <w:iCs/>
-                <w:sz w:val="20"/>
-                <w:szCs w:val="20"/>
+              <w:spacing w:line="240" w:lineRule="auto"/>
+              <w:rPr>
+                <w:iCs/>
               </w:rPr>
             </w:pPr>
             <w:r>
@@ -1497,8 +1389,6 @@
                 <w:b/>
                 <w:bCs/>
                 <w:iCs/>
-                <w:sz w:val="20"/>
-                <w:szCs w:val="20"/>
               </w:rPr>
               <w:t>Registro y creación de perfil</w:t>
             </w:r>
@@ -1509,33 +1399,26 @@
                 <w:ilvl w:val="1"/>
                 <w:numId w:val="9"/>
               </w:numPr>
-              <w:rPr>
-                <w:iCs/>
-                <w:sz w:val="20"/>
-                <w:szCs w:val="20"/>
-              </w:rPr>
-            </w:pPr>
-            <w:r>
-              <w:rPr>
-                <w:iCs/>
-                <w:sz w:val="20"/>
-                <w:szCs w:val="20"/>
+              <w:spacing w:line="240" w:lineRule="auto"/>
+              <w:rPr>
+                <w:iCs/>
+              </w:rPr>
+            </w:pPr>
+            <w:r>
+              <w:rPr>
+                <w:iCs/>
               </w:rPr>
               <w:t xml:space="preserve">Los </w:t>
             </w:r>
             <w:r>
               <w:rPr>
                 <w:iCs/>
-                <w:sz w:val="20"/>
-                <w:szCs w:val="20"/>
               </w:rPr>
               <w:t>usuarios</w:t>
             </w:r>
             <w:r>
               <w:rPr>
                 <w:iCs/>
-                <w:sz w:val="20"/>
-                <w:szCs w:val="20"/>
               </w:rPr>
               <w:t xml:space="preserve"> podrán registrarse en la plataforma y crear su “tarjeta de trabajo” o perfil digital.</w:t>
             </w:r>
@@ -1546,113 +1429,99 @@
                 <w:ilvl w:val="1"/>
                 <w:numId w:val="10"/>
               </w:numPr>
-              <w:rPr>
-                <w:iCs/>
-                <w:sz w:val="20"/>
-                <w:szCs w:val="20"/>
-              </w:rPr>
-            </w:pPr>
-            <w:r>
-              <w:rPr>
-                <w:iCs/>
-                <w:sz w:val="20"/>
-                <w:szCs w:val="20"/>
-              </w:rPr>
-              <w:t>El perfil incluirá datos como: nombre,</w:t>
-            </w:r>
-            <w:r>
-              <w:rPr>
-                <w:iCs/>
-                <w:sz w:val="20"/>
-                <w:szCs w:val="20"/>
+              <w:spacing w:line="240" w:lineRule="auto"/>
+              <w:rPr>
+                <w:iCs/>
+              </w:rPr>
+            </w:pPr>
+            <w:r>
+              <w:rPr>
+                <w:iCs/>
+              </w:rPr>
+              <w:t>La tarjeta</w:t>
+            </w:r>
+            <w:r>
+              <w:rPr>
+                <w:iCs/>
+              </w:rPr>
+              <w:t xml:space="preserve"> incluirá datos como: nombre,</w:t>
+            </w:r>
+            <w:r>
+              <w:rPr>
+                <w:iCs/>
               </w:rPr>
               <w:t xml:space="preserve"> edad, género,</w:t>
             </w:r>
             <w:r>
               <w:rPr>
                 <w:iCs/>
-                <w:sz w:val="20"/>
-                <w:szCs w:val="20"/>
               </w:rPr>
               <w:t xml:space="preserve"> servicios ofrecidos</w:t>
             </w:r>
             <w:r>
               <w:rPr>
                 <w:iCs/>
-                <w:sz w:val="20"/>
-                <w:szCs w:val="20"/>
               </w:rPr>
               <w:t xml:space="preserve"> (para trabajadores)</w:t>
             </w:r>
             <w:r>
               <w:rPr>
                 <w:iCs/>
-                <w:sz w:val="20"/>
-                <w:szCs w:val="20"/>
               </w:rPr>
               <w:t xml:space="preserve">, </w:t>
             </w:r>
             <w:r>
               <w:rPr>
                 <w:iCs/>
-                <w:sz w:val="20"/>
-                <w:szCs w:val="20"/>
               </w:rPr>
               <w:t>dirección</w:t>
             </w:r>
             <w:r>
               <w:rPr>
                 <w:iCs/>
-                <w:sz w:val="20"/>
-                <w:szCs w:val="20"/>
               </w:rPr>
               <w:t xml:space="preserve">, </w:t>
             </w:r>
             <w:r>
               <w:rPr>
                 <w:iCs/>
-                <w:sz w:val="20"/>
-                <w:szCs w:val="20"/>
-              </w:rPr>
-              <w:t>foto de perfil</w:t>
-            </w:r>
-            <w:r>
-              <w:rPr>
-                <w:iCs/>
-                <w:sz w:val="20"/>
-                <w:szCs w:val="20"/>
+              </w:rPr>
+              <w:t xml:space="preserve">foto de </w:t>
+            </w:r>
+            <w:r>
+              <w:rPr>
+                <w:iCs/>
+              </w:rPr>
+              <w:lastRenderedPageBreak/>
+              <w:t>perfil</w:t>
+            </w:r>
+            <w:r>
+              <w:rPr>
+                <w:iCs/>
               </w:rPr>
               <w:t>, certificaciones</w:t>
             </w:r>
             <w:r>
               <w:rPr>
                 <w:iCs/>
-                <w:sz w:val="20"/>
-                <w:szCs w:val="20"/>
               </w:rPr>
               <w:t xml:space="preserve">, </w:t>
             </w:r>
             <w:r>
               <w:rPr>
                 <w:iCs/>
-                <w:sz w:val="20"/>
-                <w:szCs w:val="20"/>
               </w:rPr>
               <w:t>valor por servicio</w:t>
             </w:r>
             <w:r>
               <w:rPr>
                 <w:iCs/>
-                <w:sz w:val="20"/>
-                <w:szCs w:val="20"/>
               </w:rPr>
               <w:t xml:space="preserve"> y una descripción del servicio</w:t>
             </w:r>
             <w:r>
               <w:rPr>
                 <w:iCs/>
-                <w:sz w:val="20"/>
-                <w:szCs w:val="20"/>
               </w:rPr>
               <w:t>.</w:t>
             </w:r>
@@ -1663,10 +1532,9 @@
                 <w:ilvl w:val="0"/>
                 <w:numId w:val="8"/>
               </w:numPr>
-              <w:rPr>
-                <w:iCs/>
-                <w:sz w:val="20"/>
-                <w:szCs w:val="20"/>
+              <w:spacing w:line="240" w:lineRule="auto"/>
+              <w:rPr>
+                <w:iCs/>
               </w:rPr>
             </w:pPr>
             <w:r>
@@ -1674,8 +1542,6 @@
                 <w:b/>
                 <w:bCs/>
                 <w:iCs/>
-                <w:sz w:val="20"/>
-                <w:szCs w:val="20"/>
               </w:rPr>
               <w:t>Búsqueda y contratación por parte de clientes</w:t>
             </w:r>
@@ -1686,34 +1552,26 @@
                 <w:ilvl w:val="1"/>
                 <w:numId w:val="12"/>
               </w:numPr>
-              <w:rPr>
-                <w:iCs/>
-                <w:sz w:val="20"/>
-                <w:szCs w:val="20"/>
-              </w:rPr>
-            </w:pPr>
-            <w:r>
-              <w:rPr>
-                <w:iCs/>
-                <w:sz w:val="20"/>
-                <w:szCs w:val="20"/>
-              </w:rPr>
-              <w:lastRenderedPageBreak/>
+              <w:spacing w:line="240" w:lineRule="auto"/>
+              <w:rPr>
+                <w:iCs/>
+              </w:rPr>
+            </w:pPr>
+            <w:r>
+              <w:rPr>
+                <w:iCs/>
+              </w:rPr>
               <w:t>Los clientes podrán buscar profesionales filtrando por servicio, ubicación</w:t>
             </w:r>
             <w:r>
               <w:rPr>
                 <w:iCs/>
-                <w:sz w:val="20"/>
-                <w:szCs w:val="20"/>
               </w:rPr>
               <w:t>, género y edad</w:t>
             </w:r>
             <w:r>
               <w:rPr>
                 <w:iCs/>
-                <w:sz w:val="20"/>
-                <w:szCs w:val="20"/>
               </w:rPr>
               <w:t>.</w:t>
             </w:r>
@@ -1724,17 +1582,14 @@
                 <w:ilvl w:val="1"/>
                 <w:numId w:val="13"/>
               </w:numPr>
-              <w:rPr>
-                <w:iCs/>
-                <w:sz w:val="20"/>
-                <w:szCs w:val="20"/>
-              </w:rPr>
-            </w:pPr>
-            <w:r>
-              <w:rPr>
-                <w:iCs/>
-                <w:sz w:val="20"/>
-                <w:szCs w:val="20"/>
+              <w:spacing w:line="240" w:lineRule="auto"/>
+              <w:rPr>
+                <w:iCs/>
+              </w:rPr>
+            </w:pPr>
+            <w:r>
+              <w:rPr>
+                <w:iCs/>
               </w:rPr>
               <w:t xml:space="preserve">Desde la misma plataforma podrán </w:t>
             </w:r>
@@ -1743,8 +1598,6 @@
                 <w:b/>
                 <w:bCs/>
                 <w:iCs/>
-                <w:sz w:val="20"/>
-                <w:szCs w:val="20"/>
               </w:rPr>
               <w:t>reservar</w:t>
             </w:r>
@@ -1753,16 +1606,12 @@
                 <w:b/>
                 <w:bCs/>
                 <w:iCs/>
-                <w:sz w:val="20"/>
-                <w:szCs w:val="20"/>
               </w:rPr>
               <w:t xml:space="preserve"> una fecha</w:t>
             </w:r>
             <w:r>
               <w:rPr>
                 <w:iCs/>
-                <w:sz w:val="20"/>
-                <w:szCs w:val="20"/>
               </w:rPr>
               <w:t xml:space="preserve"> y </w:t>
             </w:r>
@@ -1771,16 +1620,12 @@
                 <w:b/>
                 <w:bCs/>
                 <w:iCs/>
-                <w:sz w:val="20"/>
-                <w:szCs w:val="20"/>
               </w:rPr>
               <w:t>realizar el pago online</w:t>
             </w:r>
             <w:r>
               <w:rPr>
                 <w:iCs/>
-                <w:sz w:val="20"/>
-                <w:szCs w:val="20"/>
               </w:rPr>
               <w:t xml:space="preserve"> para mayor comodidad.</w:t>
             </w:r>
@@ -1791,10 +1636,9 @@
                 <w:ilvl w:val="0"/>
                 <w:numId w:val="8"/>
               </w:numPr>
-              <w:rPr>
-                <w:iCs/>
-                <w:sz w:val="20"/>
-                <w:szCs w:val="20"/>
+              <w:spacing w:line="240" w:lineRule="auto"/>
+              <w:rPr>
+                <w:iCs/>
               </w:rPr>
             </w:pPr>
             <w:r>
@@ -1802,8 +1646,6 @@
                 <w:b/>
                 <w:bCs/>
                 <w:iCs/>
-                <w:sz w:val="20"/>
-                <w:szCs w:val="20"/>
               </w:rPr>
               <w:t>Seguridad y confianza</w:t>
             </w:r>
@@ -1814,25 +1656,20 @@
                 <w:ilvl w:val="1"/>
                 <w:numId w:val="14"/>
               </w:numPr>
-              <w:rPr>
-                <w:iCs/>
-                <w:sz w:val="20"/>
-                <w:szCs w:val="20"/>
-              </w:rPr>
-            </w:pPr>
-            <w:r>
-              <w:rPr>
-                <w:iCs/>
-                <w:sz w:val="20"/>
-                <w:szCs w:val="20"/>
+              <w:spacing w:line="240" w:lineRule="auto"/>
+              <w:rPr>
+                <w:iCs/>
+              </w:rPr>
+            </w:pPr>
+            <w:r>
+              <w:rPr>
+                <w:iCs/>
               </w:rPr>
               <w:t>Implementaremos un sistema de validación de antecedentes</w:t>
             </w:r>
             <w:r>
               <w:rPr>
                 <w:iCs/>
-                <w:sz w:val="20"/>
-                <w:szCs w:val="20"/>
               </w:rPr>
               <w:t xml:space="preserve"> para evitar inconvenientes (por ejemplo, robos o acoso).</w:t>
             </w:r>
@@ -1843,33 +1680,26 @@
                 <w:ilvl w:val="1"/>
                 <w:numId w:val="14"/>
               </w:numPr>
-              <w:rPr>
-                <w:iCs/>
-                <w:sz w:val="20"/>
-                <w:szCs w:val="20"/>
-              </w:rPr>
-            </w:pPr>
-            <w:r>
-              <w:rPr>
-                <w:iCs/>
-                <w:sz w:val="20"/>
-                <w:szCs w:val="20"/>
+              <w:spacing w:line="240" w:lineRule="auto"/>
+              <w:rPr>
+                <w:iCs/>
+              </w:rPr>
+            </w:pPr>
+            <w:r>
+              <w:rPr>
+                <w:iCs/>
               </w:rPr>
               <w:t>Además, tendremos una v</w:t>
             </w:r>
             <w:r>
               <w:rPr>
                 <w:iCs/>
-                <w:sz w:val="20"/>
-                <w:szCs w:val="20"/>
               </w:rPr>
               <w:t>erificación de documentos que acrediten el profesionalismo del trabajador.</w:t>
             </w:r>
             <w:r>
               <w:rPr>
                 <w:iCs/>
-                <w:sz w:val="20"/>
-                <w:szCs w:val="20"/>
               </w:rPr>
               <w:t xml:space="preserve"> Pueden ser títulos, cursos, facturas o boletas de honorarios para confirmar la experiencia.</w:t>
             </w:r>
@@ -1880,49 +1710,38 @@
                 <w:ilvl w:val="1"/>
                 <w:numId w:val="15"/>
               </w:numPr>
-              <w:rPr>
-                <w:iCs/>
-                <w:sz w:val="20"/>
-                <w:szCs w:val="20"/>
-              </w:rPr>
-            </w:pPr>
-            <w:r>
-              <w:rPr>
-                <w:iCs/>
-                <w:sz w:val="20"/>
-                <w:szCs w:val="20"/>
+              <w:spacing w:line="240" w:lineRule="auto"/>
+              <w:rPr>
+                <w:iCs/>
+              </w:rPr>
+            </w:pPr>
+            <w:r>
+              <w:rPr>
+                <w:iCs/>
               </w:rPr>
               <w:t xml:space="preserve">Esto generará mayor </w:t>
             </w:r>
             <w:r>
               <w:rPr>
                 <w:iCs/>
-                <w:sz w:val="20"/>
-                <w:szCs w:val="20"/>
               </w:rPr>
               <w:t>tranquilidad</w:t>
             </w:r>
             <w:r>
               <w:rPr>
                 <w:iCs/>
-                <w:sz w:val="20"/>
-                <w:szCs w:val="20"/>
               </w:rPr>
               <w:t xml:space="preserve"> en los clientes, quienes sabrán que reciben en su hogar a personas </w:t>
             </w:r>
             <w:r>
               <w:rPr>
                 <w:iCs/>
-                <w:sz w:val="20"/>
-                <w:szCs w:val="20"/>
               </w:rPr>
               <w:t>de confianza</w:t>
             </w:r>
             <w:r>
               <w:rPr>
                 <w:iCs/>
-                <w:sz w:val="20"/>
-                <w:szCs w:val="20"/>
               </w:rPr>
               <w:t>.</w:t>
             </w:r>
@@ -1933,10 +1752,9 @@
                 <w:ilvl w:val="0"/>
                 <w:numId w:val="8"/>
               </w:numPr>
-              <w:rPr>
-                <w:iCs/>
-                <w:sz w:val="20"/>
-                <w:szCs w:val="20"/>
+              <w:spacing w:line="240" w:lineRule="auto"/>
+              <w:rPr>
+                <w:iCs/>
               </w:rPr>
             </w:pPr>
             <w:r>
@@ -1944,8 +1762,6 @@
                 <w:b/>
                 <w:bCs/>
                 <w:iCs/>
-                <w:sz w:val="20"/>
-                <w:szCs w:val="20"/>
               </w:rPr>
               <w:t>Servicios iniciales y expansión</w:t>
             </w:r>
@@ -1956,17 +1772,14 @@
                 <w:ilvl w:val="1"/>
                 <w:numId w:val="16"/>
               </w:numPr>
-              <w:rPr>
-                <w:iCs/>
-                <w:sz w:val="20"/>
-                <w:szCs w:val="20"/>
-              </w:rPr>
-            </w:pPr>
-            <w:r>
-              <w:rPr>
-                <w:iCs/>
-                <w:sz w:val="20"/>
-                <w:szCs w:val="20"/>
+              <w:spacing w:line="240" w:lineRule="auto"/>
+              <w:rPr>
+                <w:iCs/>
+              </w:rPr>
+            </w:pPr>
+            <w:r>
+              <w:rPr>
+                <w:iCs/>
               </w:rPr>
               <w:t xml:space="preserve">En una primera etapa, la plataforma se enfocará en </w:t>
             </w:r>
@@ -1975,16 +1788,12 @@
                 <w:b/>
                 <w:bCs/>
                 <w:iCs/>
-                <w:sz w:val="20"/>
-                <w:szCs w:val="20"/>
               </w:rPr>
               <w:t>limpieza del hogar</w:t>
             </w:r>
             <w:r>
               <w:rPr>
                 <w:iCs/>
-                <w:sz w:val="20"/>
-                <w:szCs w:val="20"/>
               </w:rPr>
               <w:t xml:space="preserve">, </w:t>
             </w:r>
@@ -1993,16 +1802,12 @@
                 <w:b/>
                 <w:bCs/>
                 <w:iCs/>
-                <w:sz w:val="20"/>
-                <w:szCs w:val="20"/>
               </w:rPr>
               <w:t>gasfitería</w:t>
             </w:r>
             <w:r>
               <w:rPr>
                 <w:iCs/>
-                <w:sz w:val="20"/>
-                <w:szCs w:val="20"/>
               </w:rPr>
               <w:t xml:space="preserve"> y </w:t>
             </w:r>
@@ -2011,8 +1816,6 @@
                 <w:b/>
                 <w:bCs/>
                 <w:iCs/>
-                <w:sz w:val="20"/>
-                <w:szCs w:val="20"/>
               </w:rPr>
               <w:t>jardinería</w:t>
             </w:r>
@@ -2023,17 +1826,14 @@
                 <w:ilvl w:val="1"/>
                 <w:numId w:val="17"/>
               </w:numPr>
-              <w:rPr>
-                <w:iCs/>
-                <w:sz w:val="20"/>
-                <w:szCs w:val="20"/>
-              </w:rPr>
-            </w:pPr>
-            <w:r>
-              <w:rPr>
-                <w:iCs/>
-                <w:sz w:val="20"/>
-                <w:szCs w:val="20"/>
+              <w:spacing w:line="240" w:lineRule="auto"/>
+              <w:rPr>
+                <w:iCs/>
+              </w:rPr>
+            </w:pPr>
+            <w:r>
+              <w:rPr>
+                <w:iCs/>
               </w:rPr>
               <w:t>Posteriormente, se ampliará el catálogo para incluir más tipos de servicios (ejemplos:</w:t>
             </w:r>
@@ -2042,8 +1842,6 @@
                 <w:b/>
                 <w:bCs/>
                 <w:iCs/>
-                <w:sz w:val="20"/>
-                <w:szCs w:val="20"/>
               </w:rPr>
               <w:t xml:space="preserve"> carpintería,</w:t>
             </w:r>
@@ -2052,8 +1850,6 @@
                 <w:b/>
                 <w:bCs/>
                 <w:iCs/>
-                <w:sz w:val="20"/>
-                <w:szCs w:val="20"/>
               </w:rPr>
               <w:t xml:space="preserve"> soldadura, pintura, </w:t>
             </w:r>
@@ -2062,35 +1858,28 @@
                 <w:b/>
                 <w:bCs/>
                 <w:iCs/>
-                <w:sz w:val="20"/>
-                <w:szCs w:val="20"/>
               </w:rPr>
               <w:t>etc.</w:t>
             </w:r>
             <w:r>
               <w:rPr>
                 <w:iCs/>
-                <w:sz w:val="20"/>
-                <w:szCs w:val="20"/>
               </w:rPr>
               <w:t xml:space="preserve">), permitiendo la integración de profesionales </w:t>
             </w:r>
             <w:r>
               <w:rPr>
                 <w:iCs/>
-                <w:sz w:val="20"/>
-                <w:szCs w:val="20"/>
               </w:rPr>
               <w:t>de todo tipo.</w:t>
             </w:r>
           </w:p>
           <w:p>
             <w:pPr>
+              <w:spacing w:line="240" w:lineRule="auto"/>
               <w:jc w:val="both"/>
               <w:rPr>
                 <w:iCs/>
-                <w:sz w:val="20"/>
-                <w:szCs w:val="20"/>
               </w:rPr>
             </w:pPr>
           </w:p>
@@ -2127,69 +1916,55 @@
           </w:tcPr>
           <w:p>
             <w:pPr>
+              <w:spacing w:line="240" w:lineRule="auto"/>
               <w:jc w:val="both"/>
               <w:rPr>
                 <w:iCs/>
-                <w:sz w:val="20"/>
-                <w:szCs w:val="20"/>
-              </w:rPr>
-            </w:pPr>
-            <w:r>
-              <w:rPr>
-                <w:iCs/>
-                <w:sz w:val="20"/>
-                <w:szCs w:val="20"/>
+              </w:rPr>
+            </w:pPr>
+            <w:r>
+              <w:rPr>
+                <w:iCs/>
               </w:rPr>
               <w:t>El Proyecto APT se relaciona con el perfil de egreso de Ingeniería en Informática porque permite diseñar, desarrollar e implementar una solución digital frente a una necesidad real.</w:t>
             </w:r>
           </w:p>
           <w:p>
             <w:pPr>
+              <w:spacing w:line="240" w:lineRule="auto"/>
               <w:jc w:val="both"/>
               <w:rPr>
                 <w:iCs/>
-                <w:sz w:val="20"/>
-                <w:szCs w:val="20"/>
                 <w:highlight w:val="yellow"/>
               </w:rPr>
             </w:pPr>
             <w:r>
               <w:rPr>
                 <w:iCs/>
-                <w:sz w:val="20"/>
-                <w:szCs w:val="20"/>
               </w:rPr>
               <w:t>Para lograrlo, se aplican competencias clave como el desarrollo de software, la construcción de modelos de datos, el diseño de arquitectura web</w:t>
             </w:r>
             <w:r>
               <w:rPr>
                 <w:iCs/>
-                <w:sz w:val="20"/>
-                <w:szCs w:val="20"/>
               </w:rPr>
               <w:t>,</w:t>
             </w:r>
             <w:r>
               <w:rPr>
                 <w:iCs/>
-                <w:sz w:val="20"/>
-                <w:szCs w:val="20"/>
               </w:rPr>
               <w:t xml:space="preserve"> la gestión de proyectos</w:t>
             </w:r>
             <w:r>
               <w:rPr>
                 <w:iCs/>
-                <w:sz w:val="20"/>
-                <w:szCs w:val="20"/>
               </w:rPr>
               <w:t xml:space="preserve"> e inteligencia de negocios</w:t>
             </w:r>
             <w:r>
               <w:rPr>
                 <w:iCs/>
-                <w:sz w:val="20"/>
-                <w:szCs w:val="20"/>
               </w:rPr>
               <w:t>. Estas habilidades son necesarias para resolver la problemática de conexión entre clientes y trabajadores de servicios a domicilio, mediante una plataforma confiable y funcional.</w:t>
             </w:r>
@@ -2226,51 +2001,40 @@
           </w:tcPr>
           <w:p>
             <w:pPr>
+              <w:spacing w:line="240" w:lineRule="auto"/>
               <w:jc w:val="both"/>
               <w:rPr>
                 <w:iCs/>
-                <w:sz w:val="20"/>
-                <w:szCs w:val="20"/>
                 <w:highlight w:val="yellow"/>
               </w:rPr>
             </w:pPr>
             <w:r>
               <w:rPr>
                 <w:iCs/>
-                <w:sz w:val="20"/>
-                <w:szCs w:val="20"/>
               </w:rPr>
               <w:t xml:space="preserve">Nuestros intereses profesionales están enfocados en el desarrollo de software y la creación de soluciones tecnológicas que generen impacto social. Este proyecto </w:t>
             </w:r>
             <w:r>
               <w:rPr>
                 <w:iCs/>
-                <w:sz w:val="20"/>
-                <w:szCs w:val="20"/>
               </w:rPr>
               <w:t>nos</w:t>
             </w:r>
             <w:r>
               <w:rPr>
                 <w:iCs/>
-                <w:sz w:val="20"/>
-                <w:szCs w:val="20"/>
               </w:rPr>
               <w:t xml:space="preserve"> permite aplicar esos intereses en un contexto real, fortaleciendo </w:t>
             </w:r>
             <w:r>
               <w:rPr>
                 <w:iCs/>
-                <w:sz w:val="20"/>
-                <w:szCs w:val="20"/>
               </w:rPr>
               <w:t>los</w:t>
             </w:r>
             <w:r>
               <w:rPr>
                 <w:iCs/>
-                <w:sz w:val="20"/>
-                <w:szCs w:val="20"/>
               </w:rPr>
               <w:t xml:space="preserve"> conocimientos técnicos y habilidades prácticas. A la vez, contribuye al desarrollo profesional al prepararse para enfrentar desafíos del mundo laboral y aportar con soluciones digitales útiles para la comunidad.</w:t>
             </w:r>
@@ -2296,6 +2060,7 @@
               <w:rPr>
                 <w:color w:val="1F3864"/>
               </w:rPr>
+              <w:lastRenderedPageBreak/>
               <w:t>Factibilidad de desarrollo del Proyecto APT</w:t>
             </w:r>
           </w:p>
@@ -2307,119 +2072,90 @@
           </w:tcPr>
           <w:p>
             <w:pPr>
-              <w:spacing w:before="240" w:after="240"/>
-              <w:rPr>
-                <w:iCs/>
-                <w:sz w:val="20"/>
-                <w:szCs w:val="20"/>
-              </w:rPr>
-            </w:pPr>
-            <w:r>
-              <w:rPr>
-                <w:iCs/>
-                <w:sz w:val="20"/>
-                <w:szCs w:val="20"/>
+              <w:spacing w:before="240" w:after="240" w:line="240" w:lineRule="auto"/>
+              <w:rPr>
+                <w:iCs/>
+              </w:rPr>
+            </w:pPr>
+            <w:r>
+              <w:rPr>
+                <w:iCs/>
               </w:rPr>
               <w:t>El proyecto es viable dentro del semestre, ya que se desarrollará en etapas durante 14 semanas</w:t>
             </w:r>
             <w:r>
               <w:rPr>
                 <w:iCs/>
-                <w:sz w:val="20"/>
-                <w:szCs w:val="20"/>
               </w:rPr>
               <w:t>.</w:t>
             </w:r>
           </w:p>
           <w:p>
             <w:pPr>
-              <w:spacing w:before="240" w:after="240"/>
-              <w:rPr>
-                <w:iCs/>
-                <w:sz w:val="20"/>
-                <w:szCs w:val="20"/>
-              </w:rPr>
-            </w:pPr>
-            <w:r>
-              <w:rPr>
-                <w:iCs/>
-                <w:sz w:val="20"/>
-                <w:szCs w:val="20"/>
+              <w:spacing w:before="240" w:after="240" w:line="240" w:lineRule="auto"/>
+              <w:rPr>
+                <w:iCs/>
+              </w:rPr>
+            </w:pPr>
+            <w:r>
+              <w:rPr>
+                <w:iCs/>
               </w:rPr>
               <w:t xml:space="preserve">Con el fin de obtener ganancias en base al proyecto, se cobrará una comisión de un 5% por servicio realizado, el cual puede cambiar con los años </w:t>
             </w:r>
             <w:r>
               <w:rPr>
                 <w:iCs/>
-                <w:sz w:val="20"/>
-                <w:szCs w:val="20"/>
               </w:rPr>
               <w:t>respecto a</w:t>
             </w:r>
             <w:r>
               <w:rPr>
                 <w:iCs/>
-                <w:sz w:val="20"/>
-                <w:szCs w:val="20"/>
               </w:rPr>
               <w:t xml:space="preserve"> la data que se genere.</w:t>
             </w:r>
           </w:p>
           <w:p>
             <w:pPr>
-              <w:spacing w:before="240" w:after="240"/>
-              <w:rPr>
-                <w:iCs/>
-                <w:sz w:val="20"/>
-                <w:szCs w:val="20"/>
-              </w:rPr>
-            </w:pPr>
-            <w:r>
-              <w:rPr>
-                <w:iCs/>
-                <w:sz w:val="20"/>
-                <w:szCs w:val="20"/>
-              </w:rPr>
-              <w:lastRenderedPageBreak/>
+              <w:spacing w:before="240" w:after="240" w:line="240" w:lineRule="auto"/>
+              <w:rPr>
+                <w:iCs/>
+              </w:rPr>
+            </w:pPr>
+            <w:r>
+              <w:rPr>
+                <w:iCs/>
+              </w:rPr>
               <w:t>Se utilizarán herramientas accesibles como HTML, CSS</w:t>
             </w:r>
             <w:r>
               <w:rPr>
                 <w:iCs/>
-                <w:sz w:val="20"/>
-                <w:szCs w:val="20"/>
               </w:rPr>
               <w:t xml:space="preserve">, Python, Microsoft Proyect </w:t>
             </w:r>
             <w:r>
               <w:rPr>
                 <w:iCs/>
-                <w:sz w:val="20"/>
-                <w:szCs w:val="20"/>
               </w:rPr>
               <w:t>y plataformas gratuitas como</w:t>
             </w:r>
             <w:r>
               <w:rPr>
                 <w:iCs/>
-                <w:sz w:val="20"/>
-                <w:szCs w:val="20"/>
               </w:rPr>
               <w:t xml:space="preserve"> GitHub para subir</w:t>
             </w:r>
             <w:r>
               <w:rPr>
                 <w:iCs/>
-                <w:sz w:val="20"/>
-                <w:szCs w:val="20"/>
               </w:rPr>
               <w:t xml:space="preserve"> el código y documentación, y</w:t>
             </w:r>
             <w:r>
               <w:rPr>
                 <w:iCs/>
-                <w:sz w:val="20"/>
-                <w:szCs w:val="20"/>
               </w:rPr>
               <w:t xml:space="preserve"> </w:t>
             </w:r>
@@ -2427,8 +2163,6 @@
             <w:r>
               <w:rPr>
                 <w:iCs/>
-                <w:sz w:val="20"/>
-                <w:szCs w:val="20"/>
               </w:rPr>
               <w:t>Firebase</w:t>
             </w:r>
@@ -2436,43 +2170,33 @@
             <w:r>
               <w:rPr>
                 <w:iCs/>
-                <w:sz w:val="20"/>
-                <w:szCs w:val="20"/>
               </w:rPr>
               <w:t xml:space="preserve"> para base de datos y hosting</w:t>
             </w:r>
             <w:r>
               <w:rPr>
                 <w:iCs/>
-                <w:sz w:val="20"/>
-                <w:szCs w:val="20"/>
               </w:rPr>
               <w:t>.</w:t>
             </w:r>
           </w:p>
           <w:p>
             <w:pPr>
-              <w:spacing w:before="240" w:after="240"/>
-              <w:rPr>
-                <w:iCs/>
-                <w:sz w:val="20"/>
-                <w:szCs w:val="20"/>
+              <w:spacing w:before="240" w:after="240" w:line="240" w:lineRule="auto"/>
+              <w:rPr>
+                <w:iCs/>
               </w:rPr>
             </w:pPr>
             <w:r>
               <w:rPr>
                 <w:b/>
                 <w:iCs/>
-                <w:sz w:val="20"/>
-                <w:szCs w:val="20"/>
               </w:rPr>
               <w:t>Factores que facilitan su desarrollo</w:t>
             </w:r>
             <w:r>
               <w:rPr>
                 <w:iCs/>
-                <w:sz w:val="20"/>
-                <w:szCs w:val="20"/>
               </w:rPr>
               <w:t>:</w:t>
             </w:r>
@@ -2483,26 +2207,20 @@
                 <w:ilvl w:val="0"/>
                 <w:numId w:val="2"/>
               </w:numPr>
-              <w:spacing w:before="240" w:after="0"/>
-              <w:rPr>
-                <w:iCs/>
-                <w:sz w:val="20"/>
-                <w:szCs w:val="20"/>
-              </w:rPr>
-            </w:pPr>
-            <w:r>
-              <w:rPr>
-                <w:iCs/>
-                <w:sz w:val="20"/>
-                <w:szCs w:val="20"/>
+              <w:spacing w:before="240" w:after="0" w:line="240" w:lineRule="auto"/>
+              <w:rPr>
+                <w:iCs/>
+              </w:rPr>
+            </w:pPr>
+            <w:r>
+              <w:rPr>
+                <w:iCs/>
               </w:rPr>
               <w:t>Conocimientos previos en desarrollo web.</w:t>
             </w:r>
             <w:r>
               <w:rPr>
                 <w:iCs/>
-                <w:sz w:val="20"/>
-                <w:szCs w:val="20"/>
               </w:rPr>
               <w:br/>
             </w:r>
@@ -2513,93 +2231,71 @@
                 <w:ilvl w:val="0"/>
                 <w:numId w:val="2"/>
               </w:numPr>
-              <w:spacing w:after="240"/>
-              <w:rPr>
-                <w:iCs/>
-                <w:sz w:val="20"/>
-                <w:szCs w:val="20"/>
-              </w:rPr>
-            </w:pPr>
-            <w:r>
-              <w:rPr>
-                <w:iCs/>
-                <w:sz w:val="20"/>
-                <w:szCs w:val="20"/>
+              <w:spacing w:after="240" w:line="240" w:lineRule="auto"/>
+              <w:rPr>
+                <w:iCs/>
+              </w:rPr>
+            </w:pPr>
+            <w:r>
+              <w:rPr>
+                <w:iCs/>
               </w:rPr>
               <w:t xml:space="preserve">Acceso a </w:t>
             </w:r>
             <w:r>
               <w:rPr>
                 <w:iCs/>
-                <w:sz w:val="20"/>
-                <w:szCs w:val="20"/>
               </w:rPr>
               <w:t xml:space="preserve">los </w:t>
             </w:r>
             <w:r>
               <w:rPr>
                 <w:iCs/>
-                <w:sz w:val="20"/>
-                <w:szCs w:val="20"/>
               </w:rPr>
               <w:t>recursos</w:t>
             </w:r>
             <w:r>
               <w:rPr>
                 <w:iCs/>
-                <w:sz w:val="20"/>
-                <w:szCs w:val="20"/>
               </w:rPr>
               <w:t xml:space="preserve"> mencionados</w:t>
             </w:r>
             <w:r>
               <w:rPr>
                 <w:iCs/>
-                <w:sz w:val="20"/>
-                <w:szCs w:val="20"/>
               </w:rPr>
               <w:t xml:space="preserve"> y </w:t>
             </w:r>
             <w:r>
               <w:rPr>
                 <w:iCs/>
-                <w:sz w:val="20"/>
-                <w:szCs w:val="20"/>
               </w:rPr>
               <w:t>guías online</w:t>
             </w:r>
             <w:r>
               <w:rPr>
                 <w:iCs/>
-                <w:sz w:val="20"/>
-                <w:szCs w:val="20"/>
               </w:rPr>
               <w:t>.</w:t>
             </w:r>
           </w:p>
           <w:p>
             <w:pPr>
-              <w:spacing w:before="240" w:after="240"/>
-              <w:rPr>
-                <w:iCs/>
-                <w:sz w:val="20"/>
-                <w:szCs w:val="20"/>
+              <w:spacing w:before="240" w:after="240" w:line="240" w:lineRule="auto"/>
+              <w:rPr>
+                <w:iCs/>
               </w:rPr>
             </w:pPr>
             <w:r>
               <w:rPr>
                 <w:b/>
                 <w:iCs/>
-                <w:sz w:val="20"/>
-                <w:szCs w:val="20"/>
               </w:rPr>
               <w:t>Posibles dificultades</w:t>
             </w:r>
             <w:r>
               <w:rPr>
                 <w:iCs/>
-                <w:sz w:val="20"/>
-                <w:szCs w:val="20"/>
               </w:rPr>
               <w:t>:</w:t>
             </w:r>
@@ -2610,26 +2306,20 @@
                 <w:ilvl w:val="0"/>
                 <w:numId w:val="4"/>
               </w:numPr>
-              <w:spacing w:before="240" w:after="240"/>
-              <w:rPr>
-                <w:iCs/>
-                <w:sz w:val="20"/>
-                <w:szCs w:val="20"/>
-              </w:rPr>
-            </w:pPr>
-            <w:r>
-              <w:rPr>
-                <w:iCs/>
-                <w:sz w:val="20"/>
-                <w:szCs w:val="20"/>
+              <w:spacing w:before="240" w:after="240" w:line="240" w:lineRule="auto"/>
+              <w:rPr>
+                <w:iCs/>
+              </w:rPr>
+            </w:pPr>
+            <w:r>
+              <w:rPr>
+                <w:iCs/>
               </w:rPr>
               <w:t xml:space="preserve">Falta de experiencia </w:t>
             </w:r>
             <w:r>
               <w:rPr>
                 <w:iCs/>
-                <w:sz w:val="20"/>
-                <w:szCs w:val="20"/>
               </w:rPr>
               <w:t>en el desarrollo o implementaciones del código.</w:t>
             </w:r>
@@ -2640,45 +2330,35 @@
                 <w:ilvl w:val="0"/>
                 <w:numId w:val="4"/>
               </w:numPr>
-              <w:spacing w:before="240" w:after="240"/>
-              <w:rPr>
-                <w:iCs/>
-                <w:sz w:val="20"/>
-                <w:szCs w:val="20"/>
-              </w:rPr>
-            </w:pPr>
-            <w:r>
-              <w:rPr>
-                <w:iCs/>
-                <w:sz w:val="20"/>
-                <w:szCs w:val="20"/>
+              <w:spacing w:before="240" w:after="240" w:line="240" w:lineRule="auto"/>
+              <w:rPr>
+                <w:iCs/>
+              </w:rPr>
+            </w:pPr>
+            <w:r>
+              <w:rPr>
+                <w:iCs/>
               </w:rPr>
               <w:t>Poco conocimiento de tecnicismo informático.</w:t>
             </w:r>
           </w:p>
           <w:p>
             <w:pPr>
-              <w:spacing w:before="240" w:after="240"/>
-              <w:rPr>
-                <w:iCs/>
-                <w:sz w:val="20"/>
-                <w:szCs w:val="20"/>
+              <w:spacing w:before="240" w:after="240" w:line="240" w:lineRule="auto"/>
+              <w:rPr>
+                <w:iCs/>
               </w:rPr>
             </w:pPr>
             <w:r>
               <w:rPr>
                 <w:b/>
                 <w:iCs/>
-                <w:sz w:val="20"/>
-                <w:szCs w:val="20"/>
               </w:rPr>
               <w:t>Soluciones</w:t>
             </w:r>
             <w:r>
               <w:rPr>
                 <w:iCs/>
-                <w:sz w:val="20"/>
-                <w:szCs w:val="20"/>
               </w:rPr>
               <w:t>:</w:t>
             </w:r>
@@ -2689,34 +2369,26 @@
                 <w:ilvl w:val="0"/>
                 <w:numId w:val="5"/>
               </w:numPr>
-              <w:spacing w:before="240" w:after="240"/>
+              <w:spacing w:before="240" w:after="240" w:line="240" w:lineRule="auto"/>
               <w:rPr>
                 <w:i/>
-                <w:sz w:val="20"/>
-                <w:szCs w:val="20"/>
-              </w:rPr>
-            </w:pPr>
-            <w:r>
-              <w:rPr>
-                <w:iCs/>
-                <w:sz w:val="20"/>
-                <w:szCs w:val="20"/>
+              </w:rPr>
+            </w:pPr>
+            <w:r>
+              <w:rPr>
+                <w:iCs/>
               </w:rPr>
               <w:t xml:space="preserve">Apoyo en documentación, </w:t>
             </w:r>
             <w:r>
               <w:rPr>
                 <w:iCs/>
-                <w:sz w:val="20"/>
-                <w:szCs w:val="20"/>
               </w:rPr>
               <w:t>profesores</w:t>
             </w:r>
             <w:r>
               <w:rPr>
                 <w:iCs/>
-                <w:sz w:val="20"/>
-                <w:szCs w:val="20"/>
               </w:rPr>
               <w:t xml:space="preserve"> y aprendizaje autodidacta.</w:t>
             </w:r>
@@ -2875,18 +2547,15 @@
           </w:tcPr>
           <w:p>
             <w:pPr>
+              <w:spacing w:line="240" w:lineRule="auto"/>
               <w:jc w:val="both"/>
               <w:rPr>
                 <w:iCs/>
-                <w:sz w:val="20"/>
-                <w:szCs w:val="20"/>
-              </w:rPr>
-            </w:pPr>
-            <w:r>
-              <w:rPr>
-                <w:iCs/>
-                <w:sz w:val="20"/>
-                <w:szCs w:val="20"/>
+              </w:rPr>
+            </w:pPr>
+            <w:r>
+              <w:rPr>
+                <w:iCs/>
               </w:rPr>
               <w:t>Desarrollar una plataforma web que conecte a trabajadores independientes de servicios a domicilio con los clientes.</w:t>
             </w:r>
@@ -2928,18 +2597,14 @@
                 <w:ilvl w:val="0"/>
                 <w:numId w:val="18"/>
               </w:numPr>
-              <w:spacing w:before="240" w:after="240"/>
-              <w:rPr>
-                <w:iCs/>
-                <w:sz w:val="20"/>
-                <w:szCs w:val="20"/>
-              </w:rPr>
-            </w:pPr>
-            <w:r>
-              <w:rPr>
-                <w:iCs/>
-                <w:sz w:val="20"/>
-                <w:szCs w:val="20"/>
+              <w:spacing w:before="240" w:after="240" w:line="240" w:lineRule="auto"/>
+              <w:rPr>
+                <w:iCs/>
+              </w:rPr>
+            </w:pPr>
+            <w:r>
+              <w:rPr>
+                <w:iCs/>
               </w:rPr>
               <w:t>Alcanzar un registro de al menos 500 trabajadores independientes en la plataforma durante el primer año de funcionamiento.</w:t>
             </w:r>
@@ -2947,11 +2612,9 @@
           <w:p>
             <w:pPr>
               <w:pStyle w:val="Prrafodelista"/>
-              <w:spacing w:before="240" w:after="240"/>
-              <w:rPr>
-                <w:iCs/>
-                <w:sz w:val="20"/>
-                <w:szCs w:val="20"/>
+              <w:spacing w:before="240" w:after="240" w:line="240" w:lineRule="auto"/>
+              <w:rPr>
+                <w:iCs/>
               </w:rPr>
             </w:pPr>
           </w:p>
@@ -2962,46 +2625,24 @@
                 <w:ilvl w:val="0"/>
                 <w:numId w:val="18"/>
               </w:numPr>
-              <w:spacing w:before="240" w:after="240"/>
-              <w:rPr>
-                <w:iCs/>
-                <w:sz w:val="20"/>
-                <w:szCs w:val="20"/>
-              </w:rPr>
-            </w:pPr>
-            <w:r>
-              <w:rPr>
-                <w:iCs/>
-                <w:sz w:val="20"/>
-                <w:szCs w:val="20"/>
-              </w:rPr>
-              <w:t xml:space="preserve">Lograr la inscripción de 2.000 clientes en los primeros </w:t>
-            </w:r>
-            <w:r>
-              <w:rPr>
-                <w:iCs/>
-                <w:sz w:val="20"/>
-                <w:szCs w:val="20"/>
-              </w:rPr>
-              <w:t>15</w:t>
-            </w:r>
-            <w:r>
-              <w:rPr>
-                <w:iCs/>
-                <w:sz w:val="20"/>
-                <w:szCs w:val="20"/>
-              </w:rPr>
-              <w:t xml:space="preserve"> meses de operación.</w:t>
+              <w:spacing w:before="240" w:after="240" w:line="240" w:lineRule="auto"/>
+              <w:rPr>
+                <w:iCs/>
+              </w:rPr>
+            </w:pPr>
+            <w:r>
+              <w:rPr>
+                <w:iCs/>
+              </w:rPr>
+              <w:t>Lograr la inscripción de 2.000 clientes en los primeros 15 meses de operación.</w:t>
             </w:r>
           </w:p>
           <w:p>
             <w:pPr>
               <w:pStyle w:val="Prrafodelista"/>
-              <w:spacing w:before="240" w:after="240"/>
-              <w:rPr>
-                <w:iCs/>
-                <w:sz w:val="20"/>
-                <w:szCs w:val="20"/>
+              <w:spacing w:before="240" w:after="240" w:line="240" w:lineRule="auto"/>
+              <w:rPr>
+                <w:iCs/>
               </w:rPr>
             </w:pPr>
           </w:p>
@@ -3012,46 +2653,25 @@
                 <w:ilvl w:val="0"/>
                 <w:numId w:val="18"/>
               </w:numPr>
-              <w:spacing w:before="240" w:after="240"/>
-              <w:rPr>
-                <w:iCs/>
-                <w:sz w:val="20"/>
-                <w:szCs w:val="20"/>
-              </w:rPr>
-            </w:pPr>
-            <w:r>
-              <w:rPr>
-                <w:iCs/>
-                <w:sz w:val="20"/>
-                <w:szCs w:val="20"/>
-              </w:rPr>
-              <w:t xml:space="preserve">Conseguir que al menos el </w:t>
-            </w:r>
-            <w:r>
-              <w:rPr>
-                <w:iCs/>
-                <w:sz w:val="20"/>
-                <w:szCs w:val="20"/>
-              </w:rPr>
-              <w:t>7</w:t>
-            </w:r>
-            <w:r>
-              <w:rPr>
-                <w:iCs/>
-                <w:sz w:val="20"/>
-                <w:szCs w:val="20"/>
-              </w:rPr>
-              <w:t>0% de los trabajadores cuenten con verificación de antecedentes y certificaciones en el primer año.</w:t>
+              <w:spacing w:before="240" w:after="240" w:line="240" w:lineRule="auto"/>
+              <w:rPr>
+                <w:iCs/>
+              </w:rPr>
+            </w:pPr>
+            <w:r>
+              <w:rPr>
+                <w:iCs/>
+              </w:rPr>
+              <w:lastRenderedPageBreak/>
+              <w:t>Conseguir que al menos el 70% de los trabajadores cuenten con verificación de antecedentes y certificaciones en el primer año.</w:t>
             </w:r>
           </w:p>
           <w:p>
             <w:pPr>
               <w:pStyle w:val="Prrafodelista"/>
-              <w:spacing w:before="240" w:after="240"/>
-              <w:rPr>
-                <w:iCs/>
-                <w:sz w:val="20"/>
-                <w:szCs w:val="20"/>
+              <w:spacing w:before="240" w:after="240" w:line="240" w:lineRule="auto"/>
+              <w:rPr>
+                <w:iCs/>
               </w:rPr>
             </w:pPr>
           </w:p>
@@ -3062,62 +2682,24 @@
                 <w:ilvl w:val="0"/>
                 <w:numId w:val="18"/>
               </w:numPr>
-              <w:spacing w:before="240" w:after="240"/>
-              <w:rPr>
-                <w:iCs/>
-                <w:sz w:val="20"/>
-                <w:szCs w:val="20"/>
-              </w:rPr>
-            </w:pPr>
-            <w:r>
-              <w:rPr>
-                <w:iCs/>
-                <w:sz w:val="20"/>
-                <w:szCs w:val="20"/>
-              </w:rPr>
-              <w:t xml:space="preserve">Incrementar en un </w:t>
-            </w:r>
-            <w:r>
-              <w:rPr>
-                <w:iCs/>
-                <w:sz w:val="20"/>
-                <w:szCs w:val="20"/>
-              </w:rPr>
-              <w:t>15</w:t>
-            </w:r>
-            <w:r>
-              <w:rPr>
-                <w:iCs/>
-                <w:sz w:val="20"/>
-                <w:szCs w:val="20"/>
-              </w:rPr>
-              <w:t xml:space="preserve">% la tasa de contratación mensual a lo largo de los </w:t>
-            </w:r>
-            <w:r>
-              <w:rPr>
-                <w:iCs/>
-                <w:sz w:val="20"/>
-                <w:szCs w:val="20"/>
-              </w:rPr>
-              <w:t>2</w:t>
-            </w:r>
-            <w:r>
-              <w:rPr>
-                <w:iCs/>
-                <w:sz w:val="20"/>
-                <w:szCs w:val="20"/>
-              </w:rPr>
-              <w:t xml:space="preserve"> primeros años de funcionamiento.</w:t>
+              <w:spacing w:before="240" w:after="240" w:line="240" w:lineRule="auto"/>
+              <w:rPr>
+                <w:iCs/>
+              </w:rPr>
+            </w:pPr>
+            <w:r>
+              <w:rPr>
+                <w:iCs/>
+              </w:rPr>
+              <w:t>Incrementar en un 15% la tasa de contratación mensual a lo largo de los 2 primeros años de funcionamiento.</w:t>
             </w:r>
           </w:p>
           <w:p>
             <w:pPr>
               <w:pStyle w:val="Prrafodelista"/>
-              <w:spacing w:before="240" w:after="240"/>
-              <w:rPr>
-                <w:iCs/>
-                <w:sz w:val="20"/>
-                <w:szCs w:val="20"/>
+              <w:spacing w:before="240" w:after="240" w:line="240" w:lineRule="auto"/>
+              <w:rPr>
+                <w:iCs/>
               </w:rPr>
             </w:pPr>
           </w:p>
@@ -3128,45 +2710,24 @@
                 <w:ilvl w:val="0"/>
                 <w:numId w:val="18"/>
               </w:numPr>
-              <w:spacing w:before="240" w:after="240"/>
-              <w:rPr>
-                <w:iCs/>
-                <w:sz w:val="20"/>
-                <w:szCs w:val="20"/>
-              </w:rPr>
-            </w:pPr>
-            <w:r>
-              <w:rPr>
-                <w:iCs/>
-                <w:sz w:val="20"/>
-                <w:szCs w:val="20"/>
-              </w:rPr>
-              <w:t xml:space="preserve">Conseguir que al menos el </w:t>
-            </w:r>
-            <w:r>
-              <w:rPr>
-                <w:iCs/>
-                <w:sz w:val="20"/>
-                <w:szCs w:val="20"/>
-              </w:rPr>
-              <w:t>5</w:t>
-            </w:r>
-            <w:r>
-              <w:rPr>
-                <w:iCs/>
-                <w:sz w:val="20"/>
-                <w:szCs w:val="20"/>
-              </w:rPr>
-              <w:t>0% de los clientes realicen una calificación del servicio recibido en el transcurso del primer año.</w:t>
+              <w:spacing w:before="240" w:after="240" w:line="240" w:lineRule="auto"/>
+              <w:rPr>
+                <w:iCs/>
+              </w:rPr>
+            </w:pPr>
+            <w:r>
+              <w:rPr>
+                <w:iCs/>
+              </w:rPr>
+              <w:t>Conseguir que al menos el 50% de los clientes realicen una calificación del servicio recibido en el transcurso del primer año.</w:t>
             </w:r>
           </w:p>
           <w:p>
             <w:pPr>
               <w:pStyle w:val="Prrafodelista"/>
-              <w:rPr>
-                <w:iCs/>
-                <w:sz w:val="20"/>
-                <w:szCs w:val="20"/>
+              <w:spacing w:line="240" w:lineRule="auto"/>
+              <w:rPr>
+                <w:iCs/>
               </w:rPr>
             </w:pPr>
           </w:p>
@@ -3177,18 +2738,14 @@
                 <w:ilvl w:val="0"/>
                 <w:numId w:val="18"/>
               </w:numPr>
-              <w:spacing w:before="240" w:after="240"/>
-              <w:rPr>
-                <w:iCs/>
-                <w:sz w:val="20"/>
-                <w:szCs w:val="20"/>
-              </w:rPr>
-            </w:pPr>
-            <w:r>
-              <w:rPr>
-                <w:iCs/>
-                <w:sz w:val="20"/>
-                <w:szCs w:val="20"/>
+              <w:spacing w:before="240" w:after="240" w:line="240" w:lineRule="auto"/>
+              <w:rPr>
+                <w:iCs/>
+              </w:rPr>
+            </w:pPr>
+            <w:r>
+              <w:rPr>
+                <w:iCs/>
               </w:rPr>
               <w:t>Incorporar al menos tres nuevas categorías de servicios en la plataforma dentro de los primeros dieciocho meses.</w:t>
             </w:r>
@@ -3196,11 +2753,9 @@
           <w:p>
             <w:pPr>
               <w:pStyle w:val="Prrafodelista"/>
-              <w:spacing w:before="240" w:after="240"/>
-              <w:rPr>
-                <w:iCs/>
-                <w:sz w:val="20"/>
-                <w:szCs w:val="20"/>
+              <w:spacing w:before="240" w:after="240" w:line="240" w:lineRule="auto"/>
+              <w:rPr>
+                <w:iCs/>
               </w:rPr>
             </w:pPr>
           </w:p>
@@ -3211,52 +2766,16 @@
                 <w:ilvl w:val="0"/>
                 <w:numId w:val="18"/>
               </w:numPr>
-              <w:spacing w:before="240" w:after="240"/>
-              <w:rPr>
-                <w:iCs/>
-                <w:sz w:val="20"/>
-                <w:szCs w:val="20"/>
-              </w:rPr>
-            </w:pPr>
-            <w:r>
-              <w:rPr>
-                <w:iCs/>
-                <w:sz w:val="20"/>
-                <w:szCs w:val="20"/>
-              </w:rPr>
-              <w:t xml:space="preserve">Alcanzar presencia en al menos </w:t>
-            </w:r>
-            <w:r>
-              <w:rPr>
-                <w:iCs/>
-                <w:sz w:val="20"/>
-                <w:szCs w:val="20"/>
-              </w:rPr>
-              <w:t>4</w:t>
-            </w:r>
-            <w:r>
-              <w:rPr>
-                <w:iCs/>
-                <w:sz w:val="20"/>
-                <w:szCs w:val="20"/>
-              </w:rPr>
-              <w:t xml:space="preserve"> regiones del país en los primeros </w:t>
-            </w:r>
-            <w:r>
-              <w:rPr>
-                <w:iCs/>
-                <w:sz w:val="20"/>
-                <w:szCs w:val="20"/>
-              </w:rPr>
-              <w:t>2</w:t>
-            </w:r>
-            <w:r>
-              <w:rPr>
-                <w:iCs/>
-                <w:sz w:val="20"/>
-                <w:szCs w:val="20"/>
-              </w:rPr>
-              <w:t xml:space="preserve"> años.</w:t>
+              <w:spacing w:before="240" w:after="240" w:line="240" w:lineRule="auto"/>
+              <w:rPr>
+                <w:iCs/>
+              </w:rPr>
+            </w:pPr>
+            <w:r>
+              <w:rPr>
+                <w:iCs/>
+              </w:rPr>
+              <w:t>Alcanzar presencia en al menos 4 regiones del país en los primeros 2 años.</w:t>
             </w:r>
           </w:p>
         </w:tc>
@@ -3374,80 +2893,42 @@
           </w:tcPr>
           <w:p>
             <w:pPr>
-              <w:spacing w:after="240"/>
-              <w:rPr>
-                <w:iCs/>
-                <w:sz w:val="20"/>
-                <w:szCs w:val="20"/>
-              </w:rPr>
-            </w:pPr>
-            <w:r>
-              <w:rPr>
-                <w:iCs/>
-                <w:sz w:val="20"/>
-                <w:szCs w:val="20"/>
-              </w:rPr>
-              <w:t>Justificación del uso de la metodología Scrum</w:t>
-            </w:r>
-          </w:p>
-          <w:p>
-            <w:pPr>
-              <w:spacing w:after="240"/>
-              <w:rPr>
-                <w:iCs/>
-                <w:sz w:val="20"/>
-                <w:szCs w:val="20"/>
-              </w:rPr>
-            </w:pPr>
-            <w:r>
-              <w:rPr>
-                <w:iCs/>
-                <w:sz w:val="20"/>
-                <w:szCs w:val="20"/>
-              </w:rPr>
-              <w:t>Se</w:t>
-            </w:r>
-            <w:r>
-              <w:rPr>
-                <w:iCs/>
-                <w:sz w:val="20"/>
-                <w:szCs w:val="20"/>
-              </w:rPr>
-              <w:t xml:space="preserve"> ha optado por Scrum, dado que facilita el trabajo en ciclos cortos e iterativos, permitiendo entregar avances funcionales en cada sprint y reduciendo los riesgos asociados al desarrollo.</w:t>
-            </w:r>
-          </w:p>
-          <w:p>
-            <w:pPr>
-              <w:spacing w:after="240"/>
-              <w:rPr>
-                <w:iCs/>
-                <w:sz w:val="20"/>
-                <w:szCs w:val="20"/>
-              </w:rPr>
-            </w:pPr>
-            <w:r>
-              <w:rPr>
-                <w:iCs/>
-                <w:sz w:val="20"/>
-                <w:szCs w:val="20"/>
+              <w:spacing w:after="240" w:line="240" w:lineRule="auto"/>
+              <w:rPr>
+                <w:iCs/>
+              </w:rPr>
+            </w:pPr>
+            <w:r>
+              <w:rPr>
+                <w:iCs/>
+              </w:rPr>
+              <w:t>Se ha optado por Scrum, dado que facilita el trabajo en ciclos cortos e iterativos, permitiendo entregar avances funcionales en cada sprint y reduciendo los riesgos asociados al desarrollo.</w:t>
+            </w:r>
+          </w:p>
+          <w:p>
+            <w:pPr>
+              <w:spacing w:after="240" w:line="240" w:lineRule="auto"/>
+              <w:rPr>
+                <w:iCs/>
+              </w:rPr>
+            </w:pPr>
+            <w:r>
+              <w:rPr>
+                <w:iCs/>
               </w:rPr>
               <w:t>A diferencia de metodologías tradicionales como el modelo en cascada, que son más rígidas y demandan definir todos los requisitos al inicio, Scrum posibilita priorizar funcionalidades clave y adaptarlas según la evolución del proyecto. Asimismo, frente a enfoques como Kanban, Scrum ofrece mayor estructura al organizar el trabajo en roles, backlog y entregas incrementales, lo que resulta más adecuado para asegurar valor temprano a los usuarios.</w:t>
             </w:r>
           </w:p>
           <w:p>
             <w:pPr>
-              <w:spacing w:after="240"/>
-              <w:rPr>
-                <w:iCs/>
-                <w:sz w:val="20"/>
-                <w:szCs w:val="20"/>
-              </w:rPr>
-            </w:pPr>
-            <w:r>
-              <w:rPr>
-                <w:iCs/>
-                <w:sz w:val="20"/>
-                <w:szCs w:val="20"/>
+              <w:spacing w:after="240" w:line="240" w:lineRule="auto"/>
+              <w:rPr>
+                <w:iCs/>
+              </w:rPr>
+            </w:pPr>
+            <w:r>
+              <w:rPr>
+                <w:iCs/>
               </w:rPr>
               <w:t xml:space="preserve">En conclusión, Scrum permite flexibilidad, entregas incrementales, reducción de riesgos y mejora continua, factores esenciales para el éxito de un proyecto digital como </w:t>
             </w:r>
@@ -3455,8 +2936,6 @@
             <w:r>
               <w:rPr>
                 <w:iCs/>
-                <w:sz w:val="20"/>
-                <w:szCs w:val="20"/>
               </w:rPr>
               <w:t>ServiHogar</w:t>
             </w:r>
@@ -3464,19 +2943,15 @@
             <w:r>
               <w:rPr>
                 <w:iCs/>
-                <w:sz w:val="20"/>
-                <w:szCs w:val="20"/>
               </w:rPr>
               <w:t>, cuyo propósito es crecer y evolucionar en función de las necesidades reales de clientes y trabajadores.</w:t>
             </w:r>
           </w:p>
           <w:p>
             <w:pPr>
-              <w:spacing w:after="240"/>
-              <w:rPr>
-                <w:iCs/>
-                <w:sz w:val="20"/>
-                <w:szCs w:val="20"/>
+              <w:spacing w:after="240" w:line="240" w:lineRule="auto"/>
+              <w:rPr>
+                <w:iCs/>
               </w:rPr>
             </w:pPr>
           </w:p>
@@ -3784,16 +3259,12 @@
               <w:rPr>
                 <w:b/>
                 <w:color w:val="1F3864"/>
-                <w:sz w:val="18"/>
-                <w:szCs w:val="18"/>
               </w:rPr>
             </w:pPr>
             <w:r>
               <w:rPr>
                 <w:b/>
                 <w:color w:val="1F3864"/>
-                <w:sz w:val="18"/>
-                <w:szCs w:val="18"/>
               </w:rPr>
               <w:t xml:space="preserve">Repositorio </w:t>
             </w:r>
@@ -3802,8 +3273,6 @@
               <w:rPr>
                 <w:b/>
                 <w:color w:val="1F3864"/>
-                <w:sz w:val="18"/>
-                <w:szCs w:val="18"/>
               </w:rPr>
               <w:t>Github</w:t>
             </w:r>
@@ -3832,16 +3301,12 @@
               <w:rPr>
                 <w:b/>
                 <w:color w:val="1F3864"/>
-                <w:sz w:val="18"/>
-                <w:szCs w:val="18"/>
               </w:rPr>
             </w:pPr>
             <w:r>
               <w:rPr>
                 <w:b/>
                 <w:color w:val="1F3864"/>
-                <w:sz w:val="18"/>
-                <w:szCs w:val="18"/>
               </w:rPr>
               <w:t xml:space="preserve">Repositorio </w:t>
             </w:r>
@@ -3850,8 +3315,6 @@
               <w:rPr>
                 <w:b/>
                 <w:color w:val="1F3864"/>
-                <w:sz w:val="18"/>
-                <w:szCs w:val="18"/>
               </w:rPr>
               <w:t>ServiHogar</w:t>
             </w:r>
@@ -3864,60 +3327,57 @@
           </w:tcPr>
           <w:p>
             <w:pPr>
+              <w:spacing w:line="240" w:lineRule="auto"/>
               <w:jc w:val="both"/>
               <w:rPr>
                 <w:iCs/>
-                <w:sz w:val="18"/>
-                <w:szCs w:val="18"/>
-              </w:rPr>
-            </w:pPr>
-            <w:r>
-              <w:rPr>
-                <w:iCs/>
-                <w:sz w:val="18"/>
-                <w:szCs w:val="18"/>
+              </w:rPr>
+            </w:pPr>
+            <w:r>
+              <w:rPr>
+                <w:iCs/>
               </w:rPr>
               <w:t xml:space="preserve">Se hará entrega </w:t>
             </w:r>
             <w:r>
               <w:rPr>
                 <w:iCs/>
-                <w:sz w:val="18"/>
-                <w:szCs w:val="18"/>
               </w:rPr>
               <w:t>del</w:t>
             </w:r>
             <w:r>
               <w:rPr>
                 <w:iCs/>
-                <w:sz w:val="18"/>
-                <w:szCs w:val="18"/>
               </w:rPr>
               <w:t xml:space="preserve"> </w:t>
             </w:r>
-            <w:proofErr w:type="gramStart"/>
-            <w:r>
-              <w:rPr>
-                <w:iCs/>
-                <w:sz w:val="18"/>
-                <w:szCs w:val="18"/>
-              </w:rPr>
-              <w:t>link</w:t>
-            </w:r>
-            <w:proofErr w:type="gramEnd"/>
-            <w:r>
-              <w:rPr>
-                <w:iCs/>
-                <w:sz w:val="18"/>
-                <w:szCs w:val="18"/>
+            <w:hyperlink r:id="rId8" w:history="1">
+              <w:proofErr w:type="gramStart"/>
+              <w:r>
+                <w:rPr>
+                  <w:rStyle w:val="Hipervnculo"/>
+                  <w:iCs/>
+                </w:rPr>
+                <w:t>lin</w:t>
+              </w:r>
+              <w:r>
+                <w:rPr>
+                  <w:rStyle w:val="Hipervnculo"/>
+                  <w:iCs/>
+                </w:rPr>
+                <w:t>k</w:t>
+              </w:r>
+              <w:proofErr w:type="gramEnd"/>
+            </w:hyperlink>
+            <w:r>
+              <w:rPr>
+                <w:iCs/>
               </w:rPr>
               <w:t xml:space="preserve"> al repositorio donde se trabajará la plataforma web</w:t>
             </w:r>
             <w:r>
               <w:rPr>
                 <w:iCs/>
-                <w:sz w:val="18"/>
-                <w:szCs w:val="18"/>
               </w:rPr>
               <w:t>.</w:t>
             </w:r>
@@ -3945,16 +3405,12 @@
               <w:rPr>
                 <w:b/>
                 <w:color w:val="1F3864"/>
-                <w:sz w:val="18"/>
-                <w:szCs w:val="18"/>
               </w:rPr>
             </w:pPr>
             <w:r>
               <w:rPr>
                 <w:b/>
                 <w:color w:val="1F3864"/>
-                <w:sz w:val="18"/>
-                <w:szCs w:val="18"/>
               </w:rPr>
               <w:t>Requerimiento del docente</w:t>
             </w:r>
@@ -3987,16 +3443,12 @@
               <w:rPr>
                 <w:b/>
                 <w:color w:val="1F3864"/>
-                <w:sz w:val="18"/>
-                <w:szCs w:val="18"/>
               </w:rPr>
             </w:pPr>
             <w:r>
               <w:rPr>
                 <w:b/>
                 <w:color w:val="1F3864"/>
-                <w:sz w:val="18"/>
-                <w:szCs w:val="18"/>
               </w:rPr>
               <w:t>Planificación del proyecto</w:t>
             </w:r>
@@ -4024,16 +3476,12 @@
               <w:rPr>
                 <w:b/>
                 <w:color w:val="1F3864"/>
-                <w:sz w:val="18"/>
-                <w:szCs w:val="18"/>
               </w:rPr>
             </w:pPr>
             <w:r>
               <w:rPr>
                 <w:b/>
                 <w:color w:val="1F3864"/>
-                <w:sz w:val="18"/>
-                <w:szCs w:val="18"/>
               </w:rPr>
               <w:t>Carta Gantt</w:t>
             </w:r>
@@ -4062,8 +3510,6 @@
                 <w:bCs/>
                 <w:iCs/>
                 <w:color w:val="1F3864"/>
-                <w:sz w:val="18"/>
-                <w:szCs w:val="18"/>
               </w:rPr>
             </w:pPr>
             <w:r>
@@ -4071,8 +3517,6 @@
                 <w:bCs/>
                 <w:iCs/>
                 <w:color w:val="1F3864"/>
-                <w:sz w:val="18"/>
-                <w:szCs w:val="18"/>
               </w:rPr>
               <w:t>Se hará entrega de la carta Gantt para visualizar las fechas de las actividades a realizar y definir una estructura de desarrollo en base a la metodología scrum</w:t>
             </w:r>
@@ -4081,8 +3525,6 @@
                 <w:bCs/>
                 <w:iCs/>
                 <w:color w:val="1F3864"/>
-                <w:sz w:val="18"/>
-                <w:szCs w:val="18"/>
               </w:rPr>
               <w:t>.</w:t>
             </w:r>
@@ -4110,16 +3552,12 @@
               <w:rPr>
                 <w:b/>
                 <w:color w:val="1F3864"/>
-                <w:sz w:val="18"/>
-                <w:szCs w:val="18"/>
               </w:rPr>
             </w:pPr>
             <w:r>
               <w:rPr>
                 <w:b/>
                 <w:color w:val="1F3864"/>
-                <w:sz w:val="18"/>
-                <w:szCs w:val="18"/>
               </w:rPr>
               <w:t>Requerimiento del docente</w:t>
             </w:r>
@@ -4152,16 +3590,12 @@
               <w:rPr>
                 <w:b/>
                 <w:color w:val="1F3864"/>
-                <w:sz w:val="18"/>
-                <w:szCs w:val="18"/>
               </w:rPr>
             </w:pPr>
             <w:r>
               <w:rPr>
                 <w:b/>
                 <w:color w:val="1F3864"/>
-                <w:sz w:val="18"/>
-                <w:szCs w:val="18"/>
               </w:rPr>
               <w:t xml:space="preserve">Presentación </w:t>
             </w:r>
@@ -4189,16 +3623,12 @@
               <w:rPr>
                 <w:b/>
                 <w:color w:val="1F3864"/>
-                <w:sz w:val="18"/>
-                <w:szCs w:val="18"/>
               </w:rPr>
             </w:pPr>
             <w:r>
               <w:rPr>
                 <w:b/>
                 <w:color w:val="1F3864"/>
-                <w:sz w:val="18"/>
-                <w:szCs w:val="18"/>
               </w:rPr>
               <w:t>Presentación Fase 1</w:t>
             </w:r>
@@ -4227,8 +3657,6 @@
                 <w:bCs/>
                 <w:iCs/>
                 <w:color w:val="1F3864"/>
-                <w:sz w:val="18"/>
-                <w:szCs w:val="18"/>
               </w:rPr>
             </w:pPr>
             <w:r>
@@ -4236,8 +3664,6 @@
                 <w:bCs/>
                 <w:iCs/>
                 <w:color w:val="1F3864"/>
-                <w:sz w:val="18"/>
-                <w:szCs w:val="18"/>
               </w:rPr>
               <w:t xml:space="preserve">Se </w:t>
             </w:r>
@@ -4246,8 +3672,6 @@
                 <w:bCs/>
                 <w:iCs/>
                 <w:color w:val="1F3864"/>
-                <w:sz w:val="18"/>
-                <w:szCs w:val="18"/>
               </w:rPr>
               <w:t>hará entrega</w:t>
             </w:r>
@@ -4256,8 +3680,6 @@
                 <w:bCs/>
                 <w:iCs/>
                 <w:color w:val="1F3864"/>
-                <w:sz w:val="18"/>
-                <w:szCs w:val="18"/>
               </w:rPr>
               <w:t xml:space="preserve"> del archivo PPT que muestra la presentación de la fase 1</w:t>
             </w:r>
@@ -4285,16 +3707,12 @@
               <w:rPr>
                 <w:b/>
                 <w:color w:val="1F3864"/>
-                <w:sz w:val="18"/>
-                <w:szCs w:val="18"/>
               </w:rPr>
             </w:pPr>
             <w:r>
               <w:rPr>
                 <w:b/>
                 <w:color w:val="1F3864"/>
-                <w:sz w:val="18"/>
-                <w:szCs w:val="18"/>
               </w:rPr>
               <w:t>Requerimiento del docente</w:t>
             </w:r>
@@ -4302,17 +3720,6 @@
         </w:tc>
       </w:tr>
     </w:tbl>
-    <w:p>
-      <w:pPr>
-        <w:spacing w:after="0" w:line="360" w:lineRule="auto"/>
-        <w:jc w:val="both"/>
-        <w:rPr>
-          <w:b/>
-          <w:sz w:val="24"/>
-          <w:szCs w:val="24"/>
-        </w:rPr>
-      </w:pPr>
-    </w:p>
     <w:p>
       <w:pPr>
         <w:spacing w:after="0" w:line="360" w:lineRule="auto"/>
@@ -4381,6 +3788,9 @@
         <w:jc w:val="both"/>
       </w:pPr>
       <w:r>
+        <w:rPr>
+          <w:noProof/>
+        </w:rPr>
         <w:drawing>
           <wp:inline distT="0" distB="0" distL="0" distR="0" wp14:anchorId="2C18F2A4" wp14:editId="14105149">
             <wp:extent cx="6106602" cy="4792505"/>
@@ -4397,7 +3807,7 @@
                     <pic:cNvPicPr/>
                   </pic:nvPicPr>
                   <pic:blipFill>
-                    <a:blip r:embed="rId8"/>
+                    <a:blip r:embed="rId9"/>
                     <a:stretch>
                       <a:fillRect/>
                     </a:stretch>
@@ -4419,7 +3829,8 @@
       </w:r>
     </w:p>
     <w:sectPr>
-      <w:headerReference w:type="default" r:id="rId9"/>
+      <w:headerReference w:type="default" r:id="rId10"/>
+      <w:footerReference w:type="default" r:id="rId11"/>
       <w:pgSz w:w="11906" w:h="16838"/>
       <w:pgMar w:top="1417" w:right="1701" w:bottom="1417" w:left="1701" w:header="708" w:footer="708" w:gutter="0"/>
       <w:pgNumType w:start="1"/>
@@ -4452,6 +3863,51 @@
     </w:p>
   </w:endnote>
 </w:endnotes>
+</file>
+
+<file path=word/footer1.xml><?xml version="1.0" encoding="utf-8"?>
+<w:ftr xmlns:wpc="http://schemas.microsoft.com/office/word/2010/wordprocessingCanvas" xmlns:cx="http://schemas.microsoft.com/office/drawing/2014/chartex" xmlns:cx1="http://schemas.microsoft.com/office/drawing/2015/9/8/chartex" xmlns:cx2="http://schemas.microsoft.com/office/drawing/2015/10/21/chartex" xmlns:cx3="http://schemas.microsoft.com/office/drawing/2016/5/9/chartex" xmlns:cx4="http://schemas.microsoft.com/office/drawing/2016/5/10/chartex" xmlns:cx5="http://schemas.microsoft.com/office/drawing/2016/5/11/chartex" xmlns:cx6="http://schemas.microsoft.com/office/drawing/2016/5/12/chartex" xmlns:cx7="http://schemas.microsoft.com/office/drawing/2016/5/13/chartex" xmlns:cx8="http://schemas.microsoft.com/office/drawing/2016/5/14/chartex" xmlns:mc="http://schemas.openxmlformats.org/markup-compatibility/2006" xmlns:aink="http://schemas.microsoft.com/office/drawing/2016/ink" xmlns:am3d="http://schemas.microsoft.com/office/drawing/2017/model3d" xmlns:o="urn:schemas-microsoft-com:office:office" xmlns:oel="http://schemas.microsoft.com/office/2019/extlst" xmlns:r="http://schemas.openxmlformats.org/officeDocument/2006/relationships" xmlns:m="http://schemas.openxmlformats.org/officeDocument/2006/math" xmlns:v="urn:schemas-microsoft-com:vml" xmlns:wp14="http://schemas.microsoft.com/office/word/2010/wordprocessingDrawing" xmlns:wp="http://schemas.openxmlformats.org/drawingml/2006/wordprocessingDrawing" xmlns:w10="urn:schemas-microsoft-com:office:word" xmlns:w="http://schemas.openxmlformats.org/wordprocessingml/2006/main" xmlns:w14="http://schemas.microsoft.com/office/word/2010/wordml" xmlns:w15="http://schemas.microsoft.com/office/word/2012/wordml" xmlns:w16cex="http://schemas.microsoft.com/office/word/2018/wordml/cex" xmlns:w16cid="http://schemas.microsoft.com/office/word/2016/wordml/cid" xmlns:w16="http://schemas.microsoft.com/office/word/2018/wordml" xmlns:w16du="http://schemas.microsoft.com/office/word/2023/wordml/word16du" xmlns:w16sdtdh="http://schemas.microsoft.com/office/word/2020/wordml/sdtdatahash" xmlns:w16sdtfl="http://schemas.microsoft.com/office/word/2024/wordml/sdtformatlock" xmlns:w16se="http://schemas.microsoft.com/office/word/2015/wordml/symex" xmlns:wpg="http://schemas.microsoft.com/office/word/2010/wordprocessingGroup" xmlns:wpi="http://schemas.microsoft.com/office/word/2010/wordprocessingInk" xmlns:wne="http://schemas.microsoft.com/office/word/2006/wordml" xmlns:wps="http://schemas.microsoft.com/office/word/2010/wordprocessingShape" mc:Ignorable="w14 w15 w16se w16cid w16 w16cex w16sdtdh w16sdtfl w16du wp14">
+  <w:sdt>
+    <w:sdtPr>
+      <w:id w:val="-965505835"/>
+      <w:docPartObj>
+        <w:docPartGallery w:val="Page Numbers (Bottom of Page)"/>
+        <w:docPartUnique/>
+      </w:docPartObj>
+    </w:sdtPr>
+    <w:sdtContent>
+      <w:p>
+        <w:pPr>
+          <w:pStyle w:val="Piedepgina"/>
+          <w:jc w:val="right"/>
+        </w:pPr>
+        <w:r>
+          <w:fldChar w:fldCharType="begin"/>
+        </w:r>
+        <w:r>
+          <w:instrText>PAGE   \* MERGEFORMAT</w:instrText>
+        </w:r>
+        <w:r>
+          <w:fldChar w:fldCharType="separate"/>
+        </w:r>
+        <w:r>
+          <w:rPr>
+            <w:lang w:val="es-ES"/>
+          </w:rPr>
+          <w:t>2</w:t>
+        </w:r>
+        <w:r>
+          <w:fldChar w:fldCharType="end"/>
+        </w:r>
+      </w:p>
+    </w:sdtContent>
+  </w:sdt>
+  <w:p>
+    <w:pPr>
+      <w:pStyle w:val="Piedepgina"/>
+    </w:pPr>
+  </w:p>
+</w:ftr>
 </file>
 
 <file path=word/footnotes.xml><?xml version="1.0" encoding="utf-8"?>
@@ -6365,6 +5821,7 @@
   <w:style w:type="character" w:default="1" w:styleId="Fuentedeprrafopredeter">
     <w:name w:val="Default Paragraph Font"/>
     <w:uiPriority w:val="1"/>
+    <w:semiHidden/>
     <w:unhideWhenUsed/>
   </w:style>
   <w:style w:type="table" w:default="1" w:styleId="Tablanormal">
@@ -6853,6 +6310,41 @@
       </w:tblCellMar>
     </w:tblPr>
   </w:style>
+  <w:style w:type="character" w:styleId="Hipervnculo">
+    <w:name w:val="Hyperlink"/>
+    <w:basedOn w:val="Fuentedeprrafopredeter"/>
+    <w:uiPriority w:val="99"/>
+    <w:unhideWhenUsed/>
+    <w:rsid w:val="003413DF"/>
+    <w:rPr>
+      <w:color w:val="0563C1" w:themeColor="hyperlink"/>
+      <w:u w:val="single"/>
+    </w:rPr>
+  </w:style>
+  <w:style w:type="character" w:styleId="Mencinsinresolver">
+    <w:name w:val="Unresolved Mention"/>
+    <w:basedOn w:val="Fuentedeprrafopredeter"/>
+    <w:uiPriority w:val="99"/>
+    <w:semiHidden/>
+    <w:unhideWhenUsed/>
+    <w:rsid w:val="003413DF"/>
+    <w:rPr>
+      <w:color w:val="605E5C"/>
+      <w:shd w:val="clear" w:color="auto" w:fill="E1DFDD"/>
+    </w:rPr>
+  </w:style>
+  <w:style w:type="character" w:styleId="Hipervnculovisitado">
+    <w:name w:val="FollowedHyperlink"/>
+    <w:basedOn w:val="Fuentedeprrafopredeter"/>
+    <w:uiPriority w:val="99"/>
+    <w:semiHidden/>
+    <w:unhideWhenUsed/>
+    <w:rsid w:val="003413DF"/>
+    <w:rPr>
+      <w:color w:val="954F72" w:themeColor="followedHyperlink"/>
+      <w:u w:val="single"/>
+    </w:rPr>
+  </w:style>
 </w:styles>
 </file>
 

</xml_diff>